<commit_message>
feat(chats): página de chats com GPT Maker + correção campo areaM2
Co-Authored-By: Claude Sonnet 4.6 <noreply@anthropic.com>
</commit_message>
<xml_diff>
--- a/Auditoria-ImovIA-vs-Mercado.docx
+++ b/Auditoria-ImovIA-vs-Mercado.docx
@@ -302,12 +302,6 @@
         <w:gridCol w:w="6240"/>
       </w:tblGrid>
       <w:tr>
-        <w:tblPrEx>
-          <w:tblCellMar>
-            <w:top w:w="0" w:type="dxa"/>
-            <w:bottom w:w="0" w:type="dxa"/>
-          </w:tblCellMar>
-        </w:tblPrEx>
         <w:trPr>
           <w:tblHeader/>
         </w:trPr>
@@ -373,12 +367,6 @@
         </w:tc>
       </w:tr>
       <w:tr>
-        <w:tblPrEx>
-          <w:tblCellMar>
-            <w:top w:w="0" w:type="dxa"/>
-            <w:bottom w:w="0" w:type="dxa"/>
-          </w:tblCellMar>
-        </w:tblPrEx>
         <w:tc>
           <w:tcPr>
             <w:tcW w:w="3120" w:type="dxa"/>
@@ -491,12 +479,6 @@
         </w:tc>
       </w:tr>
       <w:tr>
-        <w:tblPrEx>
-          <w:tblCellMar>
-            <w:top w:w="0" w:type="dxa"/>
-            <w:bottom w:w="0" w:type="dxa"/>
-          </w:tblCellMar>
-        </w:tblPrEx>
         <w:tc>
           <w:tcPr>
             <w:tcW w:w="3120" w:type="dxa"/>
@@ -625,12 +607,6 @@
         </w:tc>
       </w:tr>
       <w:tr>
-        <w:tblPrEx>
-          <w:tblCellMar>
-            <w:top w:w="0" w:type="dxa"/>
-            <w:bottom w:w="0" w:type="dxa"/>
-          </w:tblCellMar>
-        </w:tblPrEx>
         <w:tc>
           <w:tcPr>
             <w:tcW w:w="3120" w:type="dxa"/>
@@ -729,12 +705,6 @@
         </w:tc>
       </w:tr>
       <w:tr>
-        <w:tblPrEx>
-          <w:tblCellMar>
-            <w:top w:w="0" w:type="dxa"/>
-            <w:bottom w:w="0" w:type="dxa"/>
-          </w:tblCellMar>
-        </w:tblPrEx>
         <w:tc>
           <w:tcPr>
             <w:tcW w:w="3120" w:type="dxa"/>
@@ -854,12 +824,6 @@
         </w:tc>
       </w:tr>
       <w:tr>
-        <w:tblPrEx>
-          <w:tblCellMar>
-            <w:top w:w="0" w:type="dxa"/>
-            <w:bottom w:w="0" w:type="dxa"/>
-          </w:tblCellMar>
-        </w:tblPrEx>
         <w:tc>
           <w:tcPr>
             <w:tcW w:w="3120" w:type="dxa"/>
@@ -965,12 +929,6 @@
         </w:tc>
       </w:tr>
       <w:tr>
-        <w:tblPrEx>
-          <w:tblCellMar>
-            <w:top w:w="0" w:type="dxa"/>
-            <w:bottom w:w="0" w:type="dxa"/>
-          </w:tblCellMar>
-        </w:tblPrEx>
         <w:tc>
           <w:tcPr>
             <w:tcW w:w="3120" w:type="dxa"/>
@@ -1090,12 +1048,6 @@
         </w:tc>
       </w:tr>
       <w:tr>
-        <w:tblPrEx>
-          <w:tblCellMar>
-            <w:top w:w="0" w:type="dxa"/>
-            <w:bottom w:w="0" w:type="dxa"/>
-          </w:tblCellMar>
-        </w:tblPrEx>
         <w:tc>
           <w:tcPr>
             <w:tcW w:w="3120" w:type="dxa"/>
@@ -1158,12 +1110,6 @@
         </w:tc>
       </w:tr>
       <w:tr>
-        <w:tblPrEx>
-          <w:tblCellMar>
-            <w:top w:w="0" w:type="dxa"/>
-            <w:bottom w:w="0" w:type="dxa"/>
-          </w:tblCellMar>
-        </w:tblPrEx>
         <w:tc>
           <w:tcPr>
             <w:tcW w:w="3120" w:type="dxa"/>
@@ -1251,12 +1197,6 @@
         </w:tc>
       </w:tr>
       <w:tr>
-        <w:tblPrEx>
-          <w:tblCellMar>
-            <w:top w:w="0" w:type="dxa"/>
-            <w:bottom w:w="0" w:type="dxa"/>
-          </w:tblCellMar>
-        </w:tblPrEx>
         <w:tc>
           <w:tcPr>
             <w:tcW w:w="3120" w:type="dxa"/>
@@ -1321,12 +1261,6 @@
         </w:tc>
       </w:tr>
       <w:tr>
-        <w:tblPrEx>
-          <w:tblCellMar>
-            <w:top w:w="0" w:type="dxa"/>
-            <w:bottom w:w="0" w:type="dxa"/>
-          </w:tblCellMar>
-        </w:tblPrEx>
         <w:tc>
           <w:tcPr>
             <w:tcW w:w="3120" w:type="dxa"/>
@@ -1407,12 +1341,6 @@
         </w:tc>
       </w:tr>
       <w:tr>
-        <w:tblPrEx>
-          <w:tblCellMar>
-            <w:top w:w="0" w:type="dxa"/>
-            <w:bottom w:w="0" w:type="dxa"/>
-          </w:tblCellMar>
-        </w:tblPrEx>
         <w:tc>
           <w:tcPr>
             <w:tcW w:w="3120" w:type="dxa"/>
@@ -1493,12 +1421,6 @@
         </w:tc>
       </w:tr>
       <w:tr>
-        <w:tblPrEx>
-          <w:tblCellMar>
-            <w:top w:w="0" w:type="dxa"/>
-            <w:bottom w:w="0" w:type="dxa"/>
-          </w:tblCellMar>
-        </w:tblPrEx>
         <w:tc>
           <w:tcPr>
             <w:tcW w:w="3120" w:type="dxa"/>
@@ -1604,12 +1526,6 @@
         </w:tc>
       </w:tr>
       <w:tr>
-        <w:tblPrEx>
-          <w:tblCellMar>
-            <w:top w:w="0" w:type="dxa"/>
-            <w:bottom w:w="0" w:type="dxa"/>
-          </w:tblCellMar>
-        </w:tblPrEx>
         <w:tc>
           <w:tcPr>
             <w:tcW w:w="3120" w:type="dxa"/>
@@ -1707,12 +1623,6 @@
         </w:tc>
       </w:tr>
       <w:tr>
-        <w:tblPrEx>
-          <w:tblCellMar>
-            <w:top w:w="0" w:type="dxa"/>
-            <w:bottom w:w="0" w:type="dxa"/>
-          </w:tblCellMar>
-        </w:tblPrEx>
         <w:tc>
           <w:tcPr>
             <w:tcW w:w="3120" w:type="dxa"/>
@@ -1988,12 +1898,6 @@
         <w:gridCol w:w="5600"/>
       </w:tblGrid>
       <w:tr>
-        <w:tblPrEx>
-          <w:tblCellMar>
-            <w:top w:w="0" w:type="dxa"/>
-            <w:bottom w:w="0" w:type="dxa"/>
-          </w:tblCellMar>
-        </w:tblPrEx>
         <w:trPr>
           <w:tblHeader/>
         </w:trPr>
@@ -2126,12 +2030,6 @@
         </w:tc>
       </w:tr>
       <w:tr>
-        <w:tblPrEx>
-          <w:tblCellMar>
-            <w:top w:w="0" w:type="dxa"/>
-            <w:bottom w:w="0" w:type="dxa"/>
-          </w:tblCellMar>
-        </w:tblPrEx>
         <w:tc>
           <w:tcPr>
             <w:tcW w:w="560" w:type="dxa"/>
@@ -2347,12 +2245,6 @@
         </w:tc>
       </w:tr>
       <w:tr>
-        <w:tblPrEx>
-          <w:tblCellMar>
-            <w:top w:w="0" w:type="dxa"/>
-            <w:bottom w:w="0" w:type="dxa"/>
-          </w:tblCellMar>
-        </w:tblPrEx>
         <w:tc>
           <w:tcPr>
             <w:tcW w:w="560" w:type="dxa"/>
@@ -2548,12 +2440,6 @@
         </w:tc>
       </w:tr>
       <w:tr>
-        <w:tblPrEx>
-          <w:tblCellMar>
-            <w:top w:w="0" w:type="dxa"/>
-            <w:bottom w:w="0" w:type="dxa"/>
-          </w:tblCellMar>
-        </w:tblPrEx>
         <w:tc>
           <w:tcPr>
             <w:tcW w:w="560" w:type="dxa"/>
@@ -2731,12 +2617,6 @@
         </w:tc>
       </w:tr>
       <w:tr>
-        <w:tblPrEx>
-          <w:tblCellMar>
-            <w:top w:w="0" w:type="dxa"/>
-            <w:bottom w:w="0" w:type="dxa"/>
-          </w:tblCellMar>
-        </w:tblPrEx>
         <w:tc>
           <w:tcPr>
             <w:tcW w:w="560" w:type="dxa"/>
@@ -2944,12 +2824,6 @@
         </w:tc>
       </w:tr>
       <w:tr>
-        <w:tblPrEx>
-          <w:tblCellMar>
-            <w:top w:w="0" w:type="dxa"/>
-            <w:bottom w:w="0" w:type="dxa"/>
-          </w:tblCellMar>
-        </w:tblPrEx>
         <w:tc>
           <w:tcPr>
             <w:tcW w:w="560" w:type="dxa"/>
@@ -3258,12 +3132,6 @@
         <w:gridCol w:w="5600"/>
       </w:tblGrid>
       <w:tr>
-        <w:tblPrEx>
-          <w:tblCellMar>
-            <w:top w:w="0" w:type="dxa"/>
-            <w:bottom w:w="0" w:type="dxa"/>
-          </w:tblCellMar>
-        </w:tblPrEx>
         <w:trPr>
           <w:tblHeader/>
         </w:trPr>
@@ -3363,12 +3231,6 @@
         </w:tc>
       </w:tr>
       <w:tr>
-        <w:tblPrEx>
-          <w:tblCellMar>
-            <w:top w:w="0" w:type="dxa"/>
-            <w:bottom w:w="0" w:type="dxa"/>
-          </w:tblCellMar>
-        </w:tblPrEx>
         <w:tc>
           <w:tcPr>
             <w:tcW w:w="560" w:type="dxa"/>
@@ -3389,12 +3251,16 @@
           <w:p>
             <w:pPr>
               <w:spacing w:before="30" w:after="30"/>
-            </w:pPr>
-            <w:r>
-              <w:rPr>
-                <w:color w:val="1E293B"/>
-                <w:sz w:val="20"/>
-                <w:szCs w:val="20"/>
+              <w:rPr>
+                <w:highlight w:val="green"/>
+              </w:rPr>
+            </w:pPr>
+            <w:r>
+              <w:rPr>
+                <w:color w:val="1E293B"/>
+                <w:sz w:val="20"/>
+                <w:szCs w:val="20"/>
+                <w:highlight w:val="green"/>
               </w:rPr>
               <w:t>6</w:t>
             </w:r>
@@ -3420,13 +3286,17 @@
           <w:p>
             <w:pPr>
               <w:spacing w:before="30" w:after="30"/>
-            </w:pPr>
-            <w:proofErr w:type="spellStart"/>
-            <w:r>
-              <w:rPr>
-                <w:color w:val="1E293B"/>
-                <w:sz w:val="20"/>
-                <w:szCs w:val="20"/>
+              <w:rPr>
+                <w:highlight w:val="green"/>
+              </w:rPr>
+            </w:pPr>
+            <w:proofErr w:type="spellStart"/>
+            <w:r>
+              <w:rPr>
+                <w:color w:val="1E293B"/>
+                <w:sz w:val="20"/>
+                <w:szCs w:val="20"/>
+                <w:highlight w:val="green"/>
               </w:rPr>
               <w:t>Relatorios</w:t>
             </w:r>
@@ -3436,6 +3306,7 @@
                 <w:color w:val="1E293B"/>
                 <w:sz w:val="20"/>
                 <w:szCs w:val="20"/>
+                <w:highlight w:val="green"/>
               </w:rPr>
               <w:t xml:space="preserve"> de desempenho por corretor (matches, </w:t>
             </w:r>
@@ -3445,6 +3316,7 @@
                 <w:color w:val="1E293B"/>
                 <w:sz w:val="20"/>
                 <w:szCs w:val="20"/>
+                <w:highlight w:val="green"/>
               </w:rPr>
               <w:t>conversoes</w:t>
             </w:r>
@@ -3454,6 +3326,7 @@
                 <w:color w:val="1E293B"/>
                 <w:sz w:val="20"/>
                 <w:szCs w:val="20"/>
+                <w:highlight w:val="green"/>
               </w:rPr>
               <w:t xml:space="preserve">, tempo </w:t>
             </w:r>
@@ -3463,6 +3336,7 @@
                 <w:color w:val="1E293B"/>
                 <w:sz w:val="20"/>
                 <w:szCs w:val="20"/>
+                <w:highlight w:val="green"/>
               </w:rPr>
               <w:t>medio</w:t>
             </w:r>
@@ -3472,6 +3346,7 @@
                 <w:color w:val="1E293B"/>
                 <w:sz w:val="20"/>
                 <w:szCs w:val="20"/>
+                <w:highlight w:val="green"/>
               </w:rPr>
               <w:t xml:space="preserve"> no pipeline)</w:t>
             </w:r>
@@ -3497,13 +3372,17 @@
           <w:p>
             <w:pPr>
               <w:spacing w:before="30" w:after="30"/>
-            </w:pPr>
-            <w:proofErr w:type="spellStart"/>
-            <w:r>
-              <w:rPr>
-                <w:color w:val="1E293B"/>
-                <w:sz w:val="20"/>
-                <w:szCs w:val="20"/>
+              <w:rPr>
+                <w:highlight w:val="green"/>
+              </w:rPr>
+            </w:pPr>
+            <w:proofErr w:type="spellStart"/>
+            <w:r>
+              <w:rPr>
+                <w:color w:val="1E293B"/>
+                <w:sz w:val="20"/>
+                <w:szCs w:val="20"/>
+                <w:highlight w:val="green"/>
               </w:rPr>
               <w:t>Gestao</w:t>
             </w:r>
@@ -3513,6 +3392,7 @@
                 <w:color w:val="1E293B"/>
                 <w:sz w:val="20"/>
                 <w:szCs w:val="20"/>
+                <w:highlight w:val="green"/>
               </w:rPr>
               <w:t xml:space="preserve"> de equipe: o ADMIN </w:t>
             </w:r>
@@ -3522,6 +3402,7 @@
                 <w:color w:val="1E293B"/>
                 <w:sz w:val="20"/>
                 <w:szCs w:val="20"/>
+                <w:highlight w:val="green"/>
               </w:rPr>
               <w:t>nao</w:t>
             </w:r>
@@ -3531,6 +3412,7 @@
                 <w:color w:val="1E293B"/>
                 <w:sz w:val="20"/>
                 <w:szCs w:val="20"/>
+                <w:highlight w:val="green"/>
               </w:rPr>
               <w:t xml:space="preserve"> tem como avaliar performance individualmente nem identificar quem precisa de suporte.</w:t>
             </w:r>
@@ -3538,12 +3420,6 @@
         </w:tc>
       </w:tr>
       <w:tr>
-        <w:tblPrEx>
-          <w:tblCellMar>
-            <w:top w:w="0" w:type="dxa"/>
-            <w:bottom w:w="0" w:type="dxa"/>
-          </w:tblCellMar>
-        </w:tblPrEx>
         <w:tc>
           <w:tcPr>
             <w:tcW w:w="560" w:type="dxa"/>
@@ -3749,12 +3625,6 @@
         </w:tc>
       </w:tr>
       <w:tr>
-        <w:tblPrEx>
-          <w:tblCellMar>
-            <w:top w:w="0" w:type="dxa"/>
-            <w:bottom w:w="0" w:type="dxa"/>
-          </w:tblCellMar>
-        </w:tblPrEx>
         <w:tc>
           <w:tcPr>
             <w:tcW w:w="560" w:type="dxa"/>
@@ -3914,12 +3784,6 @@
         </w:tc>
       </w:tr>
       <w:tr>
-        <w:tblPrEx>
-          <w:tblCellMar>
-            <w:top w:w="0" w:type="dxa"/>
-            <w:bottom w:w="0" w:type="dxa"/>
-          </w:tblCellMar>
-        </w:tblPrEx>
         <w:tc>
           <w:tcPr>
             <w:tcW w:w="560" w:type="dxa"/>
@@ -4087,12 +3951,6 @@
         </w:tc>
       </w:tr>
       <w:tr>
-        <w:tblPrEx>
-          <w:tblCellMar>
-            <w:top w:w="0" w:type="dxa"/>
-            <w:bottom w:w="0" w:type="dxa"/>
-          </w:tblCellMar>
-        </w:tblPrEx>
         <w:tc>
           <w:tcPr>
             <w:tcW w:w="560" w:type="dxa"/>
@@ -4260,12 +4118,6 @@
         </w:tc>
       </w:tr>
       <w:tr>
-        <w:tblPrEx>
-          <w:tblCellMar>
-            <w:top w:w="0" w:type="dxa"/>
-            <w:bottom w:w="0" w:type="dxa"/>
-          </w:tblCellMar>
-        </w:tblPrEx>
         <w:tc>
           <w:tcPr>
             <w:tcW w:w="560" w:type="dxa"/>
@@ -4467,12 +4319,6 @@
         <w:gridCol w:w="5600"/>
       </w:tblGrid>
       <w:tr>
-        <w:tblPrEx>
-          <w:tblCellMar>
-            <w:top w:w="0" w:type="dxa"/>
-            <w:bottom w:w="0" w:type="dxa"/>
-          </w:tblCellMar>
-        </w:tblPrEx>
         <w:trPr>
           <w:tblHeader/>
         </w:trPr>
@@ -4585,12 +4431,6 @@
         </w:tc>
       </w:tr>
       <w:tr>
-        <w:tblPrEx>
-          <w:tblCellMar>
-            <w:top w:w="0" w:type="dxa"/>
-            <w:bottom w:w="0" w:type="dxa"/>
-          </w:tblCellMar>
-        </w:tblPrEx>
         <w:tc>
           <w:tcPr>
             <w:tcW w:w="560" w:type="dxa"/>
@@ -4796,12 +4636,6 @@
         </w:tc>
       </w:tr>
       <w:tr>
-        <w:tblPrEx>
-          <w:tblCellMar>
-            <w:top w:w="0" w:type="dxa"/>
-            <w:bottom w:w="0" w:type="dxa"/>
-          </w:tblCellMar>
-        </w:tblPrEx>
         <w:tc>
           <w:tcPr>
             <w:tcW w:w="560" w:type="dxa"/>
@@ -4915,12 +4749,6 @@
         </w:tc>
       </w:tr>
       <w:tr>
-        <w:tblPrEx>
-          <w:tblCellMar>
-            <w:top w:w="0" w:type="dxa"/>
-            <w:bottom w:w="0" w:type="dxa"/>
-          </w:tblCellMar>
-        </w:tblPrEx>
         <w:tc>
           <w:tcPr>
             <w:tcW w:w="560" w:type="dxa"/>
@@ -5080,12 +4908,6 @@
         </w:tc>
       </w:tr>
       <w:tr>
-        <w:tblPrEx>
-          <w:tblCellMar>
-            <w:top w:w="0" w:type="dxa"/>
-            <w:bottom w:w="0" w:type="dxa"/>
-          </w:tblCellMar>
-        </w:tblPrEx>
         <w:tc>
           <w:tcPr>
             <w:tcW w:w="560" w:type="dxa"/>
@@ -5281,12 +5103,6 @@
         </w:tc>
       </w:tr>
       <w:tr>
-        <w:tblPrEx>
-          <w:tblCellMar>
-            <w:top w:w="0" w:type="dxa"/>
-            <w:bottom w:w="0" w:type="dxa"/>
-          </w:tblCellMar>
-        </w:tblPrEx>
         <w:tc>
           <w:tcPr>
             <w:tcW w:w="560" w:type="dxa"/>
@@ -5482,12 +5298,6 @@
         </w:tc>
       </w:tr>
       <w:tr>
-        <w:tblPrEx>
-          <w:tblCellMar>
-            <w:top w:w="0" w:type="dxa"/>
-            <w:bottom w:w="0" w:type="dxa"/>
-          </w:tblCellMar>
-        </w:tblPrEx>
         <w:tc>
           <w:tcPr>
             <w:tcW w:w="560" w:type="dxa"/>
@@ -5630,12 +5440,6 @@
         </w:tc>
       </w:tr>
       <w:tr>
-        <w:tblPrEx>
-          <w:tblCellMar>
-            <w:top w:w="0" w:type="dxa"/>
-            <w:bottom w:w="0" w:type="dxa"/>
-          </w:tblCellMar>
-        </w:tblPrEx>
         <w:tc>
           <w:tcPr>
             <w:tcW w:w="560" w:type="dxa"/>
@@ -6150,12 +5954,6 @@
         <w:gridCol w:w="5160"/>
       </w:tblGrid>
       <w:tr>
-        <w:tblPrEx>
-          <w:tblCellMar>
-            <w:top w:w="0" w:type="dxa"/>
-            <w:bottom w:w="0" w:type="dxa"/>
-          </w:tblCellMar>
-        </w:tblPrEx>
         <w:trPr>
           <w:tblHeader/>
         </w:trPr>
@@ -6254,12 +6052,6 @@
         </w:tc>
       </w:tr>
       <w:tr>
-        <w:tblPrEx>
-          <w:tblCellMar>
-            <w:top w:w="0" w:type="dxa"/>
-            <w:bottom w:w="0" w:type="dxa"/>
-          </w:tblCellMar>
-        </w:tblPrEx>
         <w:tc>
           <w:tcPr>
             <w:tcW w:w="1200" w:type="dxa"/>
@@ -6445,12 +6237,6 @@
         </w:tc>
       </w:tr>
       <w:tr>
-        <w:tblPrEx>
-          <w:tblCellMar>
-            <w:top w:w="0" w:type="dxa"/>
-            <w:bottom w:w="0" w:type="dxa"/>
-          </w:tblCellMar>
-        </w:tblPrEx>
         <w:tc>
           <w:tcPr>
             <w:tcW w:w="1200" w:type="dxa"/>
@@ -6578,12 +6364,6 @@
         </w:tc>
       </w:tr>
       <w:tr>
-        <w:tblPrEx>
-          <w:tblCellMar>
-            <w:top w:w="0" w:type="dxa"/>
-            <w:bottom w:w="0" w:type="dxa"/>
-          </w:tblCellMar>
-        </w:tblPrEx>
         <w:tc>
           <w:tcPr>
             <w:tcW w:w="1200" w:type="dxa"/>
@@ -6751,12 +6531,6 @@
         </w:tc>
       </w:tr>
       <w:tr>
-        <w:tblPrEx>
-          <w:tblCellMar>
-            <w:top w:w="0" w:type="dxa"/>
-            <w:bottom w:w="0" w:type="dxa"/>
-          </w:tblCellMar>
-        </w:tblPrEx>
         <w:tc>
           <w:tcPr>
             <w:tcW w:w="1200" w:type="dxa"/>
@@ -6852,12 +6626,6 @@
         </w:tc>
       </w:tr>
       <w:tr>
-        <w:tblPrEx>
-          <w:tblCellMar>
-            <w:top w:w="0" w:type="dxa"/>
-            <w:bottom w:w="0" w:type="dxa"/>
-          </w:tblCellMar>
-        </w:tblPrEx>
         <w:tc>
           <w:tcPr>
             <w:tcW w:w="1200" w:type="dxa"/>
@@ -6971,12 +6739,6 @@
         </w:tc>
       </w:tr>
       <w:tr>
-        <w:tblPrEx>
-          <w:tblCellMar>
-            <w:top w:w="0" w:type="dxa"/>
-            <w:bottom w:w="0" w:type="dxa"/>
-          </w:tblCellMar>
-        </w:tblPrEx>
         <w:tc>
           <w:tcPr>
             <w:tcW w:w="1200" w:type="dxa"/>
@@ -7119,12 +6881,6 @@
         </w:tc>
       </w:tr>
       <w:tr>
-        <w:tblPrEx>
-          <w:tblCellMar>
-            <w:top w:w="0" w:type="dxa"/>
-            <w:bottom w:w="0" w:type="dxa"/>
-          </w:tblCellMar>
-        </w:tblPrEx>
         <w:tc>
           <w:tcPr>
             <w:tcW w:w="1200" w:type="dxa"/>
@@ -7248,12 +7004,6 @@
         </w:tc>
       </w:tr>
       <w:tr>
-        <w:tblPrEx>
-          <w:tblCellMar>
-            <w:top w:w="0" w:type="dxa"/>
-            <w:bottom w:w="0" w:type="dxa"/>
-          </w:tblCellMar>
-        </w:tblPrEx>
         <w:tc>
           <w:tcPr>
             <w:tcW w:w="1200" w:type="dxa"/>
@@ -7403,12 +7153,6 @@
         </w:tc>
       </w:tr>
       <w:tr>
-        <w:tblPrEx>
-          <w:tblCellMar>
-            <w:top w:w="0" w:type="dxa"/>
-            <w:bottom w:w="0" w:type="dxa"/>
-          </w:tblCellMar>
-        </w:tblPrEx>
         <w:tc>
           <w:tcPr>
             <w:tcW w:w="1200" w:type="dxa"/>

</xml_diff>

<commit_message>
fix(chats): corrige build - campo areaM2 e include Prisma (#3)
* feat(chats): página de chats com GPT Maker + correção campo areaM2

Co-Authored-By: Claude Sonnet 4.6 <noreply@anthropic.com>

* remove: arquivos não devem estar no repositório

---------

Co-authored-by: Tiago <corporativo80800@gmail.com>
Co-authored-by: Claude Sonnet 4.6 <noreply@anthropic.com>
</commit_message>
<xml_diff>
--- a/Auditoria-ImovIA-vs-Mercado.docx
+++ b/Auditoria-ImovIA-vs-Mercado.docx
@@ -302,12 +302,6 @@
         <w:gridCol w:w="6240"/>
       </w:tblGrid>
       <w:tr>
-        <w:tblPrEx>
-          <w:tblCellMar>
-            <w:top w:w="0" w:type="dxa"/>
-            <w:bottom w:w="0" w:type="dxa"/>
-          </w:tblCellMar>
-        </w:tblPrEx>
         <w:trPr>
           <w:tblHeader/>
         </w:trPr>
@@ -373,12 +367,6 @@
         </w:tc>
       </w:tr>
       <w:tr>
-        <w:tblPrEx>
-          <w:tblCellMar>
-            <w:top w:w="0" w:type="dxa"/>
-            <w:bottom w:w="0" w:type="dxa"/>
-          </w:tblCellMar>
-        </w:tblPrEx>
         <w:tc>
           <w:tcPr>
             <w:tcW w:w="3120" w:type="dxa"/>
@@ -491,12 +479,6 @@
         </w:tc>
       </w:tr>
       <w:tr>
-        <w:tblPrEx>
-          <w:tblCellMar>
-            <w:top w:w="0" w:type="dxa"/>
-            <w:bottom w:w="0" w:type="dxa"/>
-          </w:tblCellMar>
-        </w:tblPrEx>
         <w:tc>
           <w:tcPr>
             <w:tcW w:w="3120" w:type="dxa"/>
@@ -625,12 +607,6 @@
         </w:tc>
       </w:tr>
       <w:tr>
-        <w:tblPrEx>
-          <w:tblCellMar>
-            <w:top w:w="0" w:type="dxa"/>
-            <w:bottom w:w="0" w:type="dxa"/>
-          </w:tblCellMar>
-        </w:tblPrEx>
         <w:tc>
           <w:tcPr>
             <w:tcW w:w="3120" w:type="dxa"/>
@@ -729,12 +705,6 @@
         </w:tc>
       </w:tr>
       <w:tr>
-        <w:tblPrEx>
-          <w:tblCellMar>
-            <w:top w:w="0" w:type="dxa"/>
-            <w:bottom w:w="0" w:type="dxa"/>
-          </w:tblCellMar>
-        </w:tblPrEx>
         <w:tc>
           <w:tcPr>
             <w:tcW w:w="3120" w:type="dxa"/>
@@ -854,12 +824,6 @@
         </w:tc>
       </w:tr>
       <w:tr>
-        <w:tblPrEx>
-          <w:tblCellMar>
-            <w:top w:w="0" w:type="dxa"/>
-            <w:bottom w:w="0" w:type="dxa"/>
-          </w:tblCellMar>
-        </w:tblPrEx>
         <w:tc>
           <w:tcPr>
             <w:tcW w:w="3120" w:type="dxa"/>
@@ -965,12 +929,6 @@
         </w:tc>
       </w:tr>
       <w:tr>
-        <w:tblPrEx>
-          <w:tblCellMar>
-            <w:top w:w="0" w:type="dxa"/>
-            <w:bottom w:w="0" w:type="dxa"/>
-          </w:tblCellMar>
-        </w:tblPrEx>
         <w:tc>
           <w:tcPr>
             <w:tcW w:w="3120" w:type="dxa"/>
@@ -1090,12 +1048,6 @@
         </w:tc>
       </w:tr>
       <w:tr>
-        <w:tblPrEx>
-          <w:tblCellMar>
-            <w:top w:w="0" w:type="dxa"/>
-            <w:bottom w:w="0" w:type="dxa"/>
-          </w:tblCellMar>
-        </w:tblPrEx>
         <w:tc>
           <w:tcPr>
             <w:tcW w:w="3120" w:type="dxa"/>
@@ -1158,12 +1110,6 @@
         </w:tc>
       </w:tr>
       <w:tr>
-        <w:tblPrEx>
-          <w:tblCellMar>
-            <w:top w:w="0" w:type="dxa"/>
-            <w:bottom w:w="0" w:type="dxa"/>
-          </w:tblCellMar>
-        </w:tblPrEx>
         <w:tc>
           <w:tcPr>
             <w:tcW w:w="3120" w:type="dxa"/>
@@ -1251,12 +1197,6 @@
         </w:tc>
       </w:tr>
       <w:tr>
-        <w:tblPrEx>
-          <w:tblCellMar>
-            <w:top w:w="0" w:type="dxa"/>
-            <w:bottom w:w="0" w:type="dxa"/>
-          </w:tblCellMar>
-        </w:tblPrEx>
         <w:tc>
           <w:tcPr>
             <w:tcW w:w="3120" w:type="dxa"/>
@@ -1321,12 +1261,6 @@
         </w:tc>
       </w:tr>
       <w:tr>
-        <w:tblPrEx>
-          <w:tblCellMar>
-            <w:top w:w="0" w:type="dxa"/>
-            <w:bottom w:w="0" w:type="dxa"/>
-          </w:tblCellMar>
-        </w:tblPrEx>
         <w:tc>
           <w:tcPr>
             <w:tcW w:w="3120" w:type="dxa"/>
@@ -1407,12 +1341,6 @@
         </w:tc>
       </w:tr>
       <w:tr>
-        <w:tblPrEx>
-          <w:tblCellMar>
-            <w:top w:w="0" w:type="dxa"/>
-            <w:bottom w:w="0" w:type="dxa"/>
-          </w:tblCellMar>
-        </w:tblPrEx>
         <w:tc>
           <w:tcPr>
             <w:tcW w:w="3120" w:type="dxa"/>
@@ -1493,12 +1421,6 @@
         </w:tc>
       </w:tr>
       <w:tr>
-        <w:tblPrEx>
-          <w:tblCellMar>
-            <w:top w:w="0" w:type="dxa"/>
-            <w:bottom w:w="0" w:type="dxa"/>
-          </w:tblCellMar>
-        </w:tblPrEx>
         <w:tc>
           <w:tcPr>
             <w:tcW w:w="3120" w:type="dxa"/>
@@ -1604,12 +1526,6 @@
         </w:tc>
       </w:tr>
       <w:tr>
-        <w:tblPrEx>
-          <w:tblCellMar>
-            <w:top w:w="0" w:type="dxa"/>
-            <w:bottom w:w="0" w:type="dxa"/>
-          </w:tblCellMar>
-        </w:tblPrEx>
         <w:tc>
           <w:tcPr>
             <w:tcW w:w="3120" w:type="dxa"/>
@@ -1707,12 +1623,6 @@
         </w:tc>
       </w:tr>
       <w:tr>
-        <w:tblPrEx>
-          <w:tblCellMar>
-            <w:top w:w="0" w:type="dxa"/>
-            <w:bottom w:w="0" w:type="dxa"/>
-          </w:tblCellMar>
-        </w:tblPrEx>
         <w:tc>
           <w:tcPr>
             <w:tcW w:w="3120" w:type="dxa"/>
@@ -1988,12 +1898,6 @@
         <w:gridCol w:w="5600"/>
       </w:tblGrid>
       <w:tr>
-        <w:tblPrEx>
-          <w:tblCellMar>
-            <w:top w:w="0" w:type="dxa"/>
-            <w:bottom w:w="0" w:type="dxa"/>
-          </w:tblCellMar>
-        </w:tblPrEx>
         <w:trPr>
           <w:tblHeader/>
         </w:trPr>
@@ -2126,12 +2030,6 @@
         </w:tc>
       </w:tr>
       <w:tr>
-        <w:tblPrEx>
-          <w:tblCellMar>
-            <w:top w:w="0" w:type="dxa"/>
-            <w:bottom w:w="0" w:type="dxa"/>
-          </w:tblCellMar>
-        </w:tblPrEx>
         <w:tc>
           <w:tcPr>
             <w:tcW w:w="560" w:type="dxa"/>
@@ -2347,12 +2245,6 @@
         </w:tc>
       </w:tr>
       <w:tr>
-        <w:tblPrEx>
-          <w:tblCellMar>
-            <w:top w:w="0" w:type="dxa"/>
-            <w:bottom w:w="0" w:type="dxa"/>
-          </w:tblCellMar>
-        </w:tblPrEx>
         <w:tc>
           <w:tcPr>
             <w:tcW w:w="560" w:type="dxa"/>
@@ -2548,12 +2440,6 @@
         </w:tc>
       </w:tr>
       <w:tr>
-        <w:tblPrEx>
-          <w:tblCellMar>
-            <w:top w:w="0" w:type="dxa"/>
-            <w:bottom w:w="0" w:type="dxa"/>
-          </w:tblCellMar>
-        </w:tblPrEx>
         <w:tc>
           <w:tcPr>
             <w:tcW w:w="560" w:type="dxa"/>
@@ -2731,12 +2617,6 @@
         </w:tc>
       </w:tr>
       <w:tr>
-        <w:tblPrEx>
-          <w:tblCellMar>
-            <w:top w:w="0" w:type="dxa"/>
-            <w:bottom w:w="0" w:type="dxa"/>
-          </w:tblCellMar>
-        </w:tblPrEx>
         <w:tc>
           <w:tcPr>
             <w:tcW w:w="560" w:type="dxa"/>
@@ -2944,12 +2824,6 @@
         </w:tc>
       </w:tr>
       <w:tr>
-        <w:tblPrEx>
-          <w:tblCellMar>
-            <w:top w:w="0" w:type="dxa"/>
-            <w:bottom w:w="0" w:type="dxa"/>
-          </w:tblCellMar>
-        </w:tblPrEx>
         <w:tc>
           <w:tcPr>
             <w:tcW w:w="560" w:type="dxa"/>
@@ -3258,12 +3132,6 @@
         <w:gridCol w:w="5600"/>
       </w:tblGrid>
       <w:tr>
-        <w:tblPrEx>
-          <w:tblCellMar>
-            <w:top w:w="0" w:type="dxa"/>
-            <w:bottom w:w="0" w:type="dxa"/>
-          </w:tblCellMar>
-        </w:tblPrEx>
         <w:trPr>
           <w:tblHeader/>
         </w:trPr>
@@ -3363,12 +3231,6 @@
         </w:tc>
       </w:tr>
       <w:tr>
-        <w:tblPrEx>
-          <w:tblCellMar>
-            <w:top w:w="0" w:type="dxa"/>
-            <w:bottom w:w="0" w:type="dxa"/>
-          </w:tblCellMar>
-        </w:tblPrEx>
         <w:tc>
           <w:tcPr>
             <w:tcW w:w="560" w:type="dxa"/>
@@ -3389,12 +3251,16 @@
           <w:p>
             <w:pPr>
               <w:spacing w:before="30" w:after="30"/>
-            </w:pPr>
-            <w:r>
-              <w:rPr>
-                <w:color w:val="1E293B"/>
-                <w:sz w:val="20"/>
-                <w:szCs w:val="20"/>
+              <w:rPr>
+                <w:highlight w:val="green"/>
+              </w:rPr>
+            </w:pPr>
+            <w:r>
+              <w:rPr>
+                <w:color w:val="1E293B"/>
+                <w:sz w:val="20"/>
+                <w:szCs w:val="20"/>
+                <w:highlight w:val="green"/>
               </w:rPr>
               <w:t>6</w:t>
             </w:r>
@@ -3420,13 +3286,17 @@
           <w:p>
             <w:pPr>
               <w:spacing w:before="30" w:after="30"/>
-            </w:pPr>
-            <w:proofErr w:type="spellStart"/>
-            <w:r>
-              <w:rPr>
-                <w:color w:val="1E293B"/>
-                <w:sz w:val="20"/>
-                <w:szCs w:val="20"/>
+              <w:rPr>
+                <w:highlight w:val="green"/>
+              </w:rPr>
+            </w:pPr>
+            <w:proofErr w:type="spellStart"/>
+            <w:r>
+              <w:rPr>
+                <w:color w:val="1E293B"/>
+                <w:sz w:val="20"/>
+                <w:szCs w:val="20"/>
+                <w:highlight w:val="green"/>
               </w:rPr>
               <w:t>Relatorios</w:t>
             </w:r>
@@ -3436,6 +3306,7 @@
                 <w:color w:val="1E293B"/>
                 <w:sz w:val="20"/>
                 <w:szCs w:val="20"/>
+                <w:highlight w:val="green"/>
               </w:rPr>
               <w:t xml:space="preserve"> de desempenho por corretor (matches, </w:t>
             </w:r>
@@ -3445,6 +3316,7 @@
                 <w:color w:val="1E293B"/>
                 <w:sz w:val="20"/>
                 <w:szCs w:val="20"/>
+                <w:highlight w:val="green"/>
               </w:rPr>
               <w:t>conversoes</w:t>
             </w:r>
@@ -3454,6 +3326,7 @@
                 <w:color w:val="1E293B"/>
                 <w:sz w:val="20"/>
                 <w:szCs w:val="20"/>
+                <w:highlight w:val="green"/>
               </w:rPr>
               <w:t xml:space="preserve">, tempo </w:t>
             </w:r>
@@ -3463,6 +3336,7 @@
                 <w:color w:val="1E293B"/>
                 <w:sz w:val="20"/>
                 <w:szCs w:val="20"/>
+                <w:highlight w:val="green"/>
               </w:rPr>
               <w:t>medio</w:t>
             </w:r>
@@ -3472,6 +3346,7 @@
                 <w:color w:val="1E293B"/>
                 <w:sz w:val="20"/>
                 <w:szCs w:val="20"/>
+                <w:highlight w:val="green"/>
               </w:rPr>
               <w:t xml:space="preserve"> no pipeline)</w:t>
             </w:r>
@@ -3497,13 +3372,17 @@
           <w:p>
             <w:pPr>
               <w:spacing w:before="30" w:after="30"/>
-            </w:pPr>
-            <w:proofErr w:type="spellStart"/>
-            <w:r>
-              <w:rPr>
-                <w:color w:val="1E293B"/>
-                <w:sz w:val="20"/>
-                <w:szCs w:val="20"/>
+              <w:rPr>
+                <w:highlight w:val="green"/>
+              </w:rPr>
+            </w:pPr>
+            <w:proofErr w:type="spellStart"/>
+            <w:r>
+              <w:rPr>
+                <w:color w:val="1E293B"/>
+                <w:sz w:val="20"/>
+                <w:szCs w:val="20"/>
+                <w:highlight w:val="green"/>
               </w:rPr>
               <w:t>Gestao</w:t>
             </w:r>
@@ -3513,6 +3392,7 @@
                 <w:color w:val="1E293B"/>
                 <w:sz w:val="20"/>
                 <w:szCs w:val="20"/>
+                <w:highlight w:val="green"/>
               </w:rPr>
               <w:t xml:space="preserve"> de equipe: o ADMIN </w:t>
             </w:r>
@@ -3522,6 +3402,7 @@
                 <w:color w:val="1E293B"/>
                 <w:sz w:val="20"/>
                 <w:szCs w:val="20"/>
+                <w:highlight w:val="green"/>
               </w:rPr>
               <w:t>nao</w:t>
             </w:r>
@@ -3531,6 +3412,7 @@
                 <w:color w:val="1E293B"/>
                 <w:sz w:val="20"/>
                 <w:szCs w:val="20"/>
+                <w:highlight w:val="green"/>
               </w:rPr>
               <w:t xml:space="preserve"> tem como avaliar performance individualmente nem identificar quem precisa de suporte.</w:t>
             </w:r>
@@ -3538,12 +3420,6 @@
         </w:tc>
       </w:tr>
       <w:tr>
-        <w:tblPrEx>
-          <w:tblCellMar>
-            <w:top w:w="0" w:type="dxa"/>
-            <w:bottom w:w="0" w:type="dxa"/>
-          </w:tblCellMar>
-        </w:tblPrEx>
         <w:tc>
           <w:tcPr>
             <w:tcW w:w="560" w:type="dxa"/>
@@ -3749,12 +3625,6 @@
         </w:tc>
       </w:tr>
       <w:tr>
-        <w:tblPrEx>
-          <w:tblCellMar>
-            <w:top w:w="0" w:type="dxa"/>
-            <w:bottom w:w="0" w:type="dxa"/>
-          </w:tblCellMar>
-        </w:tblPrEx>
         <w:tc>
           <w:tcPr>
             <w:tcW w:w="560" w:type="dxa"/>
@@ -3914,12 +3784,6 @@
         </w:tc>
       </w:tr>
       <w:tr>
-        <w:tblPrEx>
-          <w:tblCellMar>
-            <w:top w:w="0" w:type="dxa"/>
-            <w:bottom w:w="0" w:type="dxa"/>
-          </w:tblCellMar>
-        </w:tblPrEx>
         <w:tc>
           <w:tcPr>
             <w:tcW w:w="560" w:type="dxa"/>
@@ -4087,12 +3951,6 @@
         </w:tc>
       </w:tr>
       <w:tr>
-        <w:tblPrEx>
-          <w:tblCellMar>
-            <w:top w:w="0" w:type="dxa"/>
-            <w:bottom w:w="0" w:type="dxa"/>
-          </w:tblCellMar>
-        </w:tblPrEx>
         <w:tc>
           <w:tcPr>
             <w:tcW w:w="560" w:type="dxa"/>
@@ -4260,12 +4118,6 @@
         </w:tc>
       </w:tr>
       <w:tr>
-        <w:tblPrEx>
-          <w:tblCellMar>
-            <w:top w:w="0" w:type="dxa"/>
-            <w:bottom w:w="0" w:type="dxa"/>
-          </w:tblCellMar>
-        </w:tblPrEx>
         <w:tc>
           <w:tcPr>
             <w:tcW w:w="560" w:type="dxa"/>
@@ -4467,12 +4319,6 @@
         <w:gridCol w:w="5600"/>
       </w:tblGrid>
       <w:tr>
-        <w:tblPrEx>
-          <w:tblCellMar>
-            <w:top w:w="0" w:type="dxa"/>
-            <w:bottom w:w="0" w:type="dxa"/>
-          </w:tblCellMar>
-        </w:tblPrEx>
         <w:trPr>
           <w:tblHeader/>
         </w:trPr>
@@ -4585,12 +4431,6 @@
         </w:tc>
       </w:tr>
       <w:tr>
-        <w:tblPrEx>
-          <w:tblCellMar>
-            <w:top w:w="0" w:type="dxa"/>
-            <w:bottom w:w="0" w:type="dxa"/>
-          </w:tblCellMar>
-        </w:tblPrEx>
         <w:tc>
           <w:tcPr>
             <w:tcW w:w="560" w:type="dxa"/>
@@ -4796,12 +4636,6 @@
         </w:tc>
       </w:tr>
       <w:tr>
-        <w:tblPrEx>
-          <w:tblCellMar>
-            <w:top w:w="0" w:type="dxa"/>
-            <w:bottom w:w="0" w:type="dxa"/>
-          </w:tblCellMar>
-        </w:tblPrEx>
         <w:tc>
           <w:tcPr>
             <w:tcW w:w="560" w:type="dxa"/>
@@ -4915,12 +4749,6 @@
         </w:tc>
       </w:tr>
       <w:tr>
-        <w:tblPrEx>
-          <w:tblCellMar>
-            <w:top w:w="0" w:type="dxa"/>
-            <w:bottom w:w="0" w:type="dxa"/>
-          </w:tblCellMar>
-        </w:tblPrEx>
         <w:tc>
           <w:tcPr>
             <w:tcW w:w="560" w:type="dxa"/>
@@ -5080,12 +4908,6 @@
         </w:tc>
       </w:tr>
       <w:tr>
-        <w:tblPrEx>
-          <w:tblCellMar>
-            <w:top w:w="0" w:type="dxa"/>
-            <w:bottom w:w="0" w:type="dxa"/>
-          </w:tblCellMar>
-        </w:tblPrEx>
         <w:tc>
           <w:tcPr>
             <w:tcW w:w="560" w:type="dxa"/>
@@ -5281,12 +5103,6 @@
         </w:tc>
       </w:tr>
       <w:tr>
-        <w:tblPrEx>
-          <w:tblCellMar>
-            <w:top w:w="0" w:type="dxa"/>
-            <w:bottom w:w="0" w:type="dxa"/>
-          </w:tblCellMar>
-        </w:tblPrEx>
         <w:tc>
           <w:tcPr>
             <w:tcW w:w="560" w:type="dxa"/>
@@ -5482,12 +5298,6 @@
         </w:tc>
       </w:tr>
       <w:tr>
-        <w:tblPrEx>
-          <w:tblCellMar>
-            <w:top w:w="0" w:type="dxa"/>
-            <w:bottom w:w="0" w:type="dxa"/>
-          </w:tblCellMar>
-        </w:tblPrEx>
         <w:tc>
           <w:tcPr>
             <w:tcW w:w="560" w:type="dxa"/>
@@ -5630,12 +5440,6 @@
         </w:tc>
       </w:tr>
       <w:tr>
-        <w:tblPrEx>
-          <w:tblCellMar>
-            <w:top w:w="0" w:type="dxa"/>
-            <w:bottom w:w="0" w:type="dxa"/>
-          </w:tblCellMar>
-        </w:tblPrEx>
         <w:tc>
           <w:tcPr>
             <w:tcW w:w="560" w:type="dxa"/>
@@ -6150,12 +5954,6 @@
         <w:gridCol w:w="5160"/>
       </w:tblGrid>
       <w:tr>
-        <w:tblPrEx>
-          <w:tblCellMar>
-            <w:top w:w="0" w:type="dxa"/>
-            <w:bottom w:w="0" w:type="dxa"/>
-          </w:tblCellMar>
-        </w:tblPrEx>
         <w:trPr>
           <w:tblHeader/>
         </w:trPr>
@@ -6254,12 +6052,6 @@
         </w:tc>
       </w:tr>
       <w:tr>
-        <w:tblPrEx>
-          <w:tblCellMar>
-            <w:top w:w="0" w:type="dxa"/>
-            <w:bottom w:w="0" w:type="dxa"/>
-          </w:tblCellMar>
-        </w:tblPrEx>
         <w:tc>
           <w:tcPr>
             <w:tcW w:w="1200" w:type="dxa"/>
@@ -6445,12 +6237,6 @@
         </w:tc>
       </w:tr>
       <w:tr>
-        <w:tblPrEx>
-          <w:tblCellMar>
-            <w:top w:w="0" w:type="dxa"/>
-            <w:bottom w:w="0" w:type="dxa"/>
-          </w:tblCellMar>
-        </w:tblPrEx>
         <w:tc>
           <w:tcPr>
             <w:tcW w:w="1200" w:type="dxa"/>
@@ -6578,12 +6364,6 @@
         </w:tc>
       </w:tr>
       <w:tr>
-        <w:tblPrEx>
-          <w:tblCellMar>
-            <w:top w:w="0" w:type="dxa"/>
-            <w:bottom w:w="0" w:type="dxa"/>
-          </w:tblCellMar>
-        </w:tblPrEx>
         <w:tc>
           <w:tcPr>
             <w:tcW w:w="1200" w:type="dxa"/>
@@ -6751,12 +6531,6 @@
         </w:tc>
       </w:tr>
       <w:tr>
-        <w:tblPrEx>
-          <w:tblCellMar>
-            <w:top w:w="0" w:type="dxa"/>
-            <w:bottom w:w="0" w:type="dxa"/>
-          </w:tblCellMar>
-        </w:tblPrEx>
         <w:tc>
           <w:tcPr>
             <w:tcW w:w="1200" w:type="dxa"/>
@@ -6852,12 +6626,6 @@
         </w:tc>
       </w:tr>
       <w:tr>
-        <w:tblPrEx>
-          <w:tblCellMar>
-            <w:top w:w="0" w:type="dxa"/>
-            <w:bottom w:w="0" w:type="dxa"/>
-          </w:tblCellMar>
-        </w:tblPrEx>
         <w:tc>
           <w:tcPr>
             <w:tcW w:w="1200" w:type="dxa"/>
@@ -6971,12 +6739,6 @@
         </w:tc>
       </w:tr>
       <w:tr>
-        <w:tblPrEx>
-          <w:tblCellMar>
-            <w:top w:w="0" w:type="dxa"/>
-            <w:bottom w:w="0" w:type="dxa"/>
-          </w:tblCellMar>
-        </w:tblPrEx>
         <w:tc>
           <w:tcPr>
             <w:tcW w:w="1200" w:type="dxa"/>
@@ -7119,12 +6881,6 @@
         </w:tc>
       </w:tr>
       <w:tr>
-        <w:tblPrEx>
-          <w:tblCellMar>
-            <w:top w:w="0" w:type="dxa"/>
-            <w:bottom w:w="0" w:type="dxa"/>
-          </w:tblCellMar>
-        </w:tblPrEx>
         <w:tc>
           <w:tcPr>
             <w:tcW w:w="1200" w:type="dxa"/>
@@ -7248,12 +7004,6 @@
         </w:tc>
       </w:tr>
       <w:tr>
-        <w:tblPrEx>
-          <w:tblCellMar>
-            <w:top w:w="0" w:type="dxa"/>
-            <w:bottom w:w="0" w:type="dxa"/>
-          </w:tblCellMar>
-        </w:tblPrEx>
         <w:tc>
           <w:tcPr>
             <w:tcW w:w="1200" w:type="dxa"/>
@@ -7403,12 +7153,6 @@
         </w:tc>
       </w:tr>
       <w:tr>
-        <w:tblPrEx>
-          <w:tblCellMar>
-            <w:top w:w="0" w:type="dxa"/>
-            <w:bottom w:w="0" w:type="dxa"/>
-          </w:tblCellMar>
-        </w:tblPrEx>
         <w:tc>
           <w:tcPr>
             <w:tcW w:w="1200" w:type="dxa"/>

</xml_diff>